<commit_message>
No receipt BC part
</commit_message>
<xml_diff>
--- a/src/Apps/W1/ExpenseAgent/app/src/Expense/Reports/NoReceiptDeclaration.docx
+++ b/src/Apps/W1/ExpenseAgent/app/src/Expense/Reports/NoReceiptDeclaration.docx
@@ -2573,7 +2573,9 @@
  < / N a v W o r d R e p o r t X m l P a r t > 
 </file>
 
-<file path=customXml/item2.xml>��< ? x m l   v e r s i o n = " 1 . 0 "   e n c o d i n g = " u t f - 1 6 " ? > < N a v W o r d R e p o r t X m l P a r t   x m l n s = " u r n : m i c r o s o f t - d y n a m i c s - b u s i n e s s c e n t r a l / i n t e r n a l / e x t e n d e d / r e p o r t s / N o _ R e c e i p t _ D e c l a r a t i o n / 6 9 5 3 / " > +<file path=customXml/item2.xml>��< ? x m l   v e r s i o n = " 1 . 0 "   e n c o d i n g = " u t f - 1 6 " ? > + 
+ < N a v W o r d R e p o r t X m l P a r t   x m l n s = " u r n : m i c r o s o f t - d y n a m i c s - b u s i n e s s c e n t r a l / i n t e r n a l / e x t e n d e d / r e p o r t s / N o _ R e c e i p t _ D e c l a r a t i o n / 6 9 5 3 / " >   
      < B C R e p o r t I n f o r m a t i o n >   
@@ -2805,7 +2807,7 @@
  
          < T o o l t i p   c o l u m n = " C u r r e n c y C o d e "   E l e m e n t I d = " 1 5 7 9 5 9 5 9 2 1 " >   
-             < T o o l t i p T e x t   l a n g = " e n - U S " > S p e c i f i e s   t h e   v a l u e   o f   t h e   C u r r e n c y   C o d e   f i e l d . < / T o o l t i p T e x t > +             < T o o l t i p T e x t   l a n g = " e n - U S " > S p e c i f i e s   t h e   c u r r e n c y   c o d e   o f   t h e   a m o u n t . < / T o o l t i p T e x t >   
          < / T o o l t i p >   

</xml_diff>